<commit_message>
Added pdf of documentation
</commit_message>
<xml_diff>
--- a/Bikers Analysis Documentation.docx
+++ b/Bikers Analysis Documentation.docx
@@ -81,8 +81,8 @@
           <w:rFonts w:hint="default" w:ascii="Tahoma" w:hAnsi="Tahoma" w:cs="Tahoma"/>
           <w:b/>
           <w:bCs/>
-          <w:sz w:val="36"/>
-          <w:szCs w:val="36"/>
+          <w:sz w:val="40"/>
+          <w:szCs w:val="40"/>
           <w:lang w:val="en-US"/>
         </w:rPr>
       </w:pPr>
@@ -91,8 +91,8 @@
           <w:rFonts w:hint="default" w:ascii="Tahoma" w:hAnsi="Tahoma" w:cs="Tahoma"/>
           <w:b/>
           <w:bCs/>
-          <w:sz w:val="36"/>
-          <w:szCs w:val="36"/>
+          <w:sz w:val="40"/>
+          <w:szCs w:val="40"/>
           <w:lang w:val="en-US"/>
         </w:rPr>
         <w:t>Tools Used</w:t>
@@ -282,8 +282,8 @@
           <w:rFonts w:hint="default" w:ascii="Tahoma" w:hAnsi="Tahoma" w:cs="Tahoma"/>
           <w:b/>
           <w:bCs/>
-          <w:sz w:val="36"/>
-          <w:szCs w:val="36"/>
+          <w:sz w:val="22"/>
+          <w:szCs w:val="22"/>
           <w:lang w:val="en-US"/>
         </w:rPr>
       </w:pPr>
@@ -294,8 +294,8 @@
           <w:rFonts w:hint="default" w:ascii="Tahoma" w:hAnsi="Tahoma" w:cs="Tahoma"/>
           <w:b/>
           <w:bCs/>
-          <w:sz w:val="36"/>
-          <w:szCs w:val="36"/>
+          <w:sz w:val="40"/>
+          <w:szCs w:val="40"/>
           <w:lang w:val="en-US"/>
         </w:rPr>
       </w:pPr>
@@ -304,8 +304,8 @@
           <w:rFonts w:hint="default" w:ascii="Tahoma" w:hAnsi="Tahoma" w:cs="Tahoma"/>
           <w:b/>
           <w:bCs/>
-          <w:sz w:val="36"/>
-          <w:szCs w:val="36"/>
+          <w:sz w:val="40"/>
+          <w:szCs w:val="40"/>
           <w:lang w:val="en-US"/>
         </w:rPr>
         <w:t>Business problem</w:t>
@@ -323,35 +323,38 @@
     </w:p>
     <w:p>
       <w:pPr>
-        <w:rPr>
-          <w:rFonts w:hint="default" w:ascii="Tahoma" w:hAnsi="Tahoma" w:cs="Tahoma"/>
-          <w:sz w:val="22"/>
-          <w:szCs w:val="22"/>
-          <w:lang w:val="en-US"/>
-        </w:rPr>
-      </w:pPr>
-      <w:r>
-        <w:rPr>
-          <w:rFonts w:hint="default" w:ascii="Tahoma" w:hAnsi="Tahoma" w:cs="Tahoma"/>
-          <w:sz w:val="22"/>
-          <w:szCs w:val="22"/>
-          <w:lang w:val="en-US"/>
-        </w:rPr>
-        <w:t>The problem is casual riders are not interested in getting annual memberships.</w:t>
-      </w:r>
-    </w:p>
-    <w:p>
-      <w:pPr>
-        <w:rPr>
-          <w:rFonts w:hint="default" w:ascii="Tahoma" w:hAnsi="Tahoma" w:cs="Tahoma"/>
-          <w:sz w:val="22"/>
-          <w:szCs w:val="22"/>
-          <w:lang w:val="en-US"/>
-        </w:rPr>
-      </w:pPr>
-    </w:p>
-    <w:p>
-      <w:pPr>
+        <w:jc w:val="both"/>
+        <w:rPr>
+          <w:rFonts w:hint="default" w:ascii="Tahoma" w:hAnsi="Tahoma" w:cs="Tahoma"/>
+          <w:sz w:val="22"/>
+          <w:szCs w:val="22"/>
+          <w:lang w:val="en-US"/>
+        </w:rPr>
+      </w:pPr>
+      <w:r>
+        <w:rPr>
+          <w:rFonts w:hint="default" w:ascii="Tahoma" w:hAnsi="Tahoma" w:cs="Tahoma"/>
+          <w:sz w:val="22"/>
+          <w:szCs w:val="22"/>
+          <w:lang w:val="en-US"/>
+        </w:rPr>
+        <w:t>For a bike-share company, they have customers that are casual bikers who are one-time users of their bike, and there are members who are part of the annual membership. The problem for this company is casual riders are not interested in getting annual memberships.</w:t>
+      </w:r>
+    </w:p>
+    <w:p>
+      <w:pPr>
+        <w:jc w:val="both"/>
+        <w:rPr>
+          <w:rFonts w:hint="default" w:ascii="Tahoma" w:hAnsi="Tahoma" w:cs="Tahoma"/>
+          <w:sz w:val="22"/>
+          <w:szCs w:val="22"/>
+          <w:lang w:val="en-US"/>
+        </w:rPr>
+      </w:pPr>
+    </w:p>
+    <w:p>
+      <w:pPr>
+        <w:jc w:val="both"/>
         <w:rPr>
           <w:rFonts w:hint="default" w:ascii="Tahoma" w:hAnsi="Tahoma" w:cs="Tahoma"/>
           <w:sz w:val="22"/>
@@ -371,8 +374,8 @@
       <w:r>
         <w:rPr>
           <w:rFonts w:hint="default" w:ascii="Tahoma" w:hAnsi="Tahoma" w:cs="Tahoma"/>
-          <w:sz w:val="24"/>
-          <w:szCs w:val="24"/>
+          <w:sz w:val="22"/>
+          <w:szCs w:val="22"/>
           <w:lang w:val="en-US"/>
         </w:rPr>
         <w:t xml:space="preserve">ow casual riders are different from annual members and use them to create a plan to convert casual riders into annual </w:t>
@@ -380,8 +383,8 @@
       <w:r>
         <w:rPr>
           <w:rFonts w:hint="default" w:ascii="Tahoma" w:hAnsi="Tahoma" w:cs="Tahoma"/>
-          <w:sz w:val="24"/>
-          <w:szCs w:val="24"/>
+          <w:sz w:val="22"/>
+          <w:szCs w:val="22"/>
           <w:lang w:val="en-PH"/>
         </w:rPr>
         <w:t xml:space="preserve">subscribing </w:t>
@@ -389,8 +392,8 @@
       <w:r>
         <w:rPr>
           <w:rFonts w:hint="default" w:ascii="Tahoma" w:hAnsi="Tahoma" w:cs="Tahoma"/>
-          <w:sz w:val="24"/>
-          <w:szCs w:val="24"/>
+          <w:sz w:val="22"/>
+          <w:szCs w:val="22"/>
           <w:lang w:val="en-US"/>
         </w:rPr>
         <w:t>members</w:t>
@@ -398,8 +401,8 @@
       <w:r>
         <w:rPr>
           <w:rFonts w:hint="default" w:ascii="Tahoma" w:hAnsi="Tahoma" w:cs="Tahoma"/>
-          <w:sz w:val="24"/>
-          <w:szCs w:val="24"/>
+          <w:sz w:val="22"/>
+          <w:szCs w:val="22"/>
           <w:lang w:val="en-PH"/>
         </w:rPr>
         <w:t>.</w:t>
@@ -421,8 +424,8 @@
           <w:rFonts w:hint="default" w:ascii="Tahoma" w:hAnsi="Tahoma" w:cs="Tahoma"/>
           <w:b/>
           <w:bCs/>
-          <w:sz w:val="36"/>
-          <w:szCs w:val="36"/>
+          <w:sz w:val="40"/>
+          <w:szCs w:val="40"/>
           <w:lang w:val="en-US"/>
         </w:rPr>
       </w:pPr>
@@ -431,8 +434,8 @@
           <w:rFonts w:hint="default" w:ascii="Tahoma" w:hAnsi="Tahoma" w:cs="Tahoma"/>
           <w:b/>
           <w:bCs/>
-          <w:sz w:val="36"/>
-          <w:szCs w:val="36"/>
+          <w:sz w:val="40"/>
+          <w:szCs w:val="40"/>
           <w:lang w:val="en-US"/>
         </w:rPr>
         <w:t>About the data</w:t>
@@ -450,6 +453,7 @@
     </w:p>
     <w:p>
       <w:pPr>
+        <w:jc w:val="both"/>
         <w:rPr>
           <w:rFonts w:hint="default" w:ascii="Tahoma" w:hAnsi="Tahoma" w:cs="Tahoma"/>
           <w:sz w:val="22"/>
@@ -487,6 +491,7 @@
     </w:p>
     <w:p>
       <w:pPr>
+        <w:jc w:val="both"/>
         <w:rPr>
           <w:rFonts w:hint="default" w:ascii="Tahoma" w:hAnsi="Tahoma" w:cs="Tahoma"/>
           <w:sz w:val="22"/>
@@ -523,7 +528,7 @@
       </w:r>
       <w:r>
         <w:rPr>
-          <w:rStyle w:val="5"/>
+          <w:rStyle w:val="7"/>
           <w:rFonts w:hint="default" w:ascii="Tahoma" w:hAnsi="Tahoma" w:cs="Tahoma"/>
           <w:sz w:val="22"/>
           <w:szCs w:val="22"/>
@@ -543,16 +548,18 @@
     </w:p>
     <w:p>
       <w:pPr>
-        <w:rPr>
-          <w:rFonts w:hint="default" w:ascii="Tahoma" w:hAnsi="Tahoma" w:cs="Tahoma"/>
-          <w:sz w:val="22"/>
-          <w:szCs w:val="22"/>
-          <w:lang w:val="en-US"/>
-        </w:rPr>
-      </w:pPr>
-    </w:p>
-    <w:p>
-      <w:pPr>
+        <w:jc w:val="both"/>
+        <w:rPr>
+          <w:rFonts w:hint="default" w:ascii="Tahoma" w:hAnsi="Tahoma" w:cs="Tahoma"/>
+          <w:sz w:val="22"/>
+          <w:szCs w:val="22"/>
+          <w:lang w:val="en-US"/>
+        </w:rPr>
+      </w:pPr>
+    </w:p>
+    <w:p>
+      <w:pPr>
+        <w:jc w:val="both"/>
         <w:rPr>
           <w:rFonts w:hint="default" w:ascii="Tahoma" w:hAnsi="Tahoma" w:cs="Tahoma"/>
           <w:sz w:val="22"/>
@@ -590,16 +597,18 @@
     </w:p>
     <w:p>
       <w:pPr>
-        <w:rPr>
-          <w:rFonts w:hint="default" w:ascii="Tahoma" w:hAnsi="Tahoma" w:cs="Tahoma"/>
-          <w:sz w:val="22"/>
-          <w:szCs w:val="22"/>
-          <w:lang w:val="en-US"/>
-        </w:rPr>
-      </w:pPr>
-    </w:p>
-    <w:p>
-      <w:pPr>
+        <w:jc w:val="both"/>
+        <w:rPr>
+          <w:rFonts w:hint="default" w:ascii="Tahoma" w:hAnsi="Tahoma" w:cs="Tahoma"/>
+          <w:sz w:val="22"/>
+          <w:szCs w:val="22"/>
+          <w:lang w:val="en-US"/>
+        </w:rPr>
+      </w:pPr>
+    </w:p>
+    <w:p>
+      <w:pPr>
+        <w:jc w:val="both"/>
         <w:rPr>
           <w:rFonts w:hint="default" w:ascii="Tahoma" w:hAnsi="Tahoma" w:cs="Tahoma"/>
           <w:sz w:val="22"/>
@@ -619,16 +628,18 @@
     </w:p>
     <w:p>
       <w:pPr>
-        <w:rPr>
-          <w:rFonts w:hint="default" w:ascii="Tahoma" w:hAnsi="Tahoma" w:cs="Tahoma"/>
-          <w:sz w:val="22"/>
-          <w:szCs w:val="22"/>
-          <w:lang w:val="en-US"/>
-        </w:rPr>
-      </w:pPr>
-    </w:p>
-    <w:p>
-      <w:pPr>
+        <w:jc w:val="both"/>
+        <w:rPr>
+          <w:rFonts w:hint="default" w:ascii="Tahoma" w:hAnsi="Tahoma" w:cs="Tahoma"/>
+          <w:sz w:val="22"/>
+          <w:szCs w:val="22"/>
+          <w:lang w:val="en-US"/>
+        </w:rPr>
+      </w:pPr>
+    </w:p>
+    <w:p>
+      <w:pPr>
+        <w:jc w:val="both"/>
         <w:rPr>
           <w:rFonts w:hint="default" w:ascii="Tahoma" w:hAnsi="Tahoma" w:cs="Tahoma"/>
           <w:sz w:val="22"/>
@@ -668,21 +679,22 @@
     </w:p>
     <w:p>
       <w:pPr>
-        <w:rPr>
-          <w:rFonts w:hint="default" w:ascii="Tahoma" w:hAnsi="Tahoma" w:cs="Tahoma"/>
-          <w:sz w:val="22"/>
-          <w:szCs w:val="22"/>
-          <w:lang w:val="en-US"/>
-        </w:rPr>
-      </w:pPr>
-    </w:p>
-    <w:p>
-      <w:pPr>
-        <w:jc w:val="both"/>
-        <w:rPr>
-          <w:rFonts w:hint="default" w:ascii="Tahoma" w:hAnsi="Tahoma" w:cs="Tahoma"/>
-          <w:sz w:val="36"/>
-          <w:szCs w:val="36"/>
+        <w:jc w:val="both"/>
+        <w:rPr>
+          <w:rFonts w:hint="default" w:ascii="Tahoma" w:hAnsi="Tahoma" w:cs="Tahoma"/>
+          <w:sz w:val="22"/>
+          <w:szCs w:val="22"/>
+          <w:lang w:val="en-US"/>
+        </w:rPr>
+      </w:pPr>
+    </w:p>
+    <w:p>
+      <w:pPr>
+        <w:jc w:val="both"/>
+        <w:rPr>
+          <w:rFonts w:hint="default" w:ascii="Tahoma" w:hAnsi="Tahoma" w:cs="Tahoma"/>
+          <w:sz w:val="40"/>
+          <w:szCs w:val="40"/>
           <w:lang w:val="en-US"/>
         </w:rPr>
       </w:pPr>
@@ -691,8 +703,8 @@
           <w:rFonts w:hint="default" w:ascii="Tahoma" w:hAnsi="Tahoma" w:cs="Tahoma"/>
           <w:b/>
           <w:bCs/>
-          <w:sz w:val="36"/>
-          <w:szCs w:val="36"/>
+          <w:sz w:val="40"/>
+          <w:szCs w:val="40"/>
           <w:lang w:val="en-US"/>
         </w:rPr>
         <w:t>Data cleaning</w:t>
@@ -710,6 +722,7 @@
     </w:p>
     <w:p>
       <w:pPr>
+        <w:jc w:val="both"/>
         <w:rPr>
           <w:rFonts w:hint="default" w:ascii="Tahoma" w:hAnsi="Tahoma" w:cs="Tahoma"/>
           <w:sz w:val="22"/>
@@ -734,6 +747,7 @@
           <w:numId w:val="2"/>
         </w:numPr>
         <w:ind w:firstLine="720" w:firstLineChars="0"/>
+        <w:jc w:val="both"/>
         <w:rPr>
           <w:rFonts w:hint="default" w:ascii="Tahoma" w:hAnsi="Tahoma" w:cs="Tahoma"/>
           <w:sz w:val="22"/>
@@ -758,6 +772,7 @@
           <w:numId w:val="2"/>
         </w:numPr>
         <w:ind w:firstLine="720" w:firstLineChars="0"/>
+        <w:jc w:val="both"/>
         <w:rPr>
           <w:rFonts w:hint="default" w:ascii="Tahoma" w:hAnsi="Tahoma" w:cs="Tahoma"/>
           <w:sz w:val="22"/>
@@ -782,6 +797,7 @@
           <w:numId w:val="2"/>
         </w:numPr>
         <w:ind w:firstLine="720" w:firstLineChars="0"/>
+        <w:jc w:val="both"/>
         <w:rPr>
           <w:rFonts w:hint="default" w:ascii="Tahoma" w:hAnsi="Tahoma" w:cs="Tahoma"/>
           <w:sz w:val="22"/>
@@ -805,6 +821,7 @@
           <w:ilvl w:val="0"/>
           <w:numId w:val="0"/>
         </w:numPr>
+        <w:jc w:val="both"/>
         <w:rPr>
           <w:rFonts w:hint="default" w:ascii="Tahoma" w:hAnsi="Tahoma" w:cs="Tahoma"/>
           <w:sz w:val="22"/>
@@ -819,6 +836,7 @@
           <w:ilvl w:val="0"/>
           <w:numId w:val="0"/>
         </w:numPr>
+        <w:jc w:val="both"/>
         <w:rPr>
           <w:rFonts w:hint="default" w:ascii="Tahoma" w:hAnsi="Tahoma" w:cs="Tahoma"/>
           <w:sz w:val="22"/>
@@ -842,6 +860,7 @@
           <w:ilvl w:val="0"/>
           <w:numId w:val="0"/>
         </w:numPr>
+        <w:jc w:val="both"/>
         <w:rPr>
           <w:rFonts w:hint="default" w:ascii="Tahoma" w:hAnsi="Tahoma" w:cs="Tahoma"/>
           <w:sz w:val="22"/>
@@ -856,6 +875,7 @@
           <w:ilvl w:val="0"/>
           <w:numId w:val="0"/>
         </w:numPr>
+        <w:jc w:val="both"/>
         <w:rPr>
           <w:rFonts w:hint="default" w:ascii="Tahoma" w:hAnsi="Tahoma" w:cs="Tahoma"/>
           <w:sz w:val="22"/>
@@ -916,6 +936,7 @@
           <w:ilvl w:val="0"/>
           <w:numId w:val="0"/>
         </w:numPr>
+        <w:jc w:val="both"/>
         <w:rPr>
           <w:rFonts w:hint="default" w:ascii="Tahoma" w:hAnsi="Tahoma" w:cs="Tahoma"/>
           <w:sz w:val="22"/>
@@ -930,6 +951,7 @@
           <w:ilvl w:val="0"/>
           <w:numId w:val="0"/>
         </w:numPr>
+        <w:jc w:val="both"/>
         <w:rPr>
           <w:rFonts w:hint="default" w:ascii="Tahoma" w:hAnsi="Tahoma" w:cs="Tahoma"/>
           <w:sz w:val="22"/>
@@ -953,6 +975,7 @@
           <w:ilvl w:val="0"/>
           <w:numId w:val="0"/>
         </w:numPr>
+        <w:jc w:val="both"/>
         <w:rPr>
           <w:rFonts w:hint="default" w:ascii="Tahoma" w:hAnsi="Tahoma" w:cs="Tahoma"/>
           <w:sz w:val="22"/>
@@ -967,6 +990,7 @@
           <w:ilvl w:val="0"/>
           <w:numId w:val="0"/>
         </w:numPr>
+        <w:jc w:val="both"/>
         <w:rPr>
           <w:rFonts w:hint="default" w:ascii="Tahoma" w:hAnsi="Tahoma" w:cs="Tahoma"/>
           <w:sz w:val="22"/>
@@ -1104,6 +1128,7 @@
           <w:ilvl w:val="0"/>
           <w:numId w:val="0"/>
         </w:numPr>
+        <w:jc w:val="both"/>
         <w:rPr>
           <w:rFonts w:hint="default" w:ascii="Tahoma" w:hAnsi="Tahoma" w:cs="Tahoma"/>
           <w:sz w:val="22"/>
@@ -1127,6 +1152,7 @@
           <w:ilvl w:val="0"/>
           <w:numId w:val="0"/>
         </w:numPr>
+        <w:jc w:val="both"/>
         <w:rPr>
           <w:rFonts w:hint="default" w:ascii="Tahoma" w:hAnsi="Tahoma" w:cs="Tahoma"/>
           <w:sz w:val="22"/>
@@ -1141,6 +1167,7 @@
           <w:ilvl w:val="0"/>
           <w:numId w:val="0"/>
         </w:numPr>
+        <w:jc w:val="both"/>
         <w:rPr>
           <w:rFonts w:hint="default" w:ascii="Tahoma" w:hAnsi="Tahoma" w:cs="Tahoma"/>
           <w:sz w:val="22"/>
@@ -1177,7 +1204,7 @@
       </w:r>
       <w:r>
         <w:rPr>
-          <w:rStyle w:val="5"/>
+          <w:rStyle w:val="7"/>
           <w:rFonts w:hint="default" w:ascii="Tahoma" w:hAnsi="Tahoma" w:cs="Tahoma"/>
           <w:sz w:val="22"/>
           <w:szCs w:val="22"/>
@@ -1201,6 +1228,7 @@
           <w:ilvl w:val="0"/>
           <w:numId w:val="0"/>
         </w:numPr>
+        <w:jc w:val="both"/>
         <w:rPr>
           <w:rFonts w:hint="default" w:ascii="Tahoma" w:hAnsi="Tahoma" w:cs="Tahoma"/>
           <w:sz w:val="22"/>
@@ -1215,6 +1243,7 @@
           <w:ilvl w:val="0"/>
           <w:numId w:val="0"/>
         </w:numPr>
+        <w:jc w:val="both"/>
         <w:rPr>
           <w:rFonts w:hint="default" w:ascii="Tahoma" w:hAnsi="Tahoma" w:cs="Tahoma"/>
           <w:sz w:val="22"/>
@@ -1395,6 +1424,7 @@
           <w:ilvl w:val="0"/>
           <w:numId w:val="0"/>
         </w:numPr>
+        <w:jc w:val="both"/>
         <w:rPr>
           <w:rFonts w:hint="default" w:ascii="Tahoma" w:hAnsi="Tahoma" w:cs="Tahoma"/>
           <w:sz w:val="22"/>
@@ -1439,6 +1469,7 @@
           <w:ilvl w:val="0"/>
           <w:numId w:val="0"/>
         </w:numPr>
+        <w:jc w:val="both"/>
         <w:rPr>
           <w:rFonts w:hint="default" w:ascii="Tahoma" w:hAnsi="Tahoma" w:cs="Tahoma"/>
           <w:sz w:val="22"/>
@@ -1528,6 +1559,7 @@
           <w:ilvl w:val="0"/>
           <w:numId w:val="0"/>
         </w:numPr>
+        <w:jc w:val="both"/>
         <w:rPr>
           <w:rFonts w:hint="default" w:ascii="Tahoma" w:hAnsi="Tahoma" w:cs="Tahoma"/>
           <w:sz w:val="22"/>
@@ -1810,6 +1842,7 @@
     </w:p>
     <w:p>
       <w:pPr>
+        <w:jc w:val="both"/>
         <w:rPr>
           <w:rFonts w:hint="default" w:ascii="Tahoma" w:hAnsi="Tahoma" w:cs="Tahoma"/>
           <w:sz w:val="22"/>
@@ -1829,6 +1862,7 @@
     </w:p>
     <w:p>
       <w:pPr>
+        <w:jc w:val="both"/>
         <w:rPr>
           <w:rFonts w:hint="default" w:ascii="Tahoma" w:hAnsi="Tahoma" w:cs="Tahoma"/>
           <w:sz w:val="22"/>
@@ -1918,128 +1952,7 @@
     </w:p>
     <w:p>
       <w:pPr>
-        <w:jc w:val="left"/>
-        <w:rPr>
-          <w:rFonts w:hint="default" w:ascii="Tahoma" w:hAnsi="Tahoma" w:cs="Tahoma"/>
-          <w:sz w:val="22"/>
-          <w:szCs w:val="22"/>
-          <w:lang w:val="en-US"/>
-        </w:rPr>
-      </w:pPr>
-    </w:p>
-    <w:p>
-      <w:pPr>
-        <w:jc w:val="left"/>
-        <w:rPr>
-          <w:rFonts w:hint="default" w:ascii="Tahoma" w:hAnsi="Tahoma" w:cs="Tahoma"/>
-          <w:sz w:val="22"/>
-          <w:szCs w:val="22"/>
-          <w:lang w:val="en-US"/>
-        </w:rPr>
-      </w:pPr>
-    </w:p>
-    <w:p>
-      <w:pPr>
-        <w:jc w:val="left"/>
-        <w:rPr>
-          <w:rFonts w:hint="default" w:ascii="Tahoma" w:hAnsi="Tahoma" w:cs="Tahoma"/>
-          <w:sz w:val="22"/>
-          <w:szCs w:val="22"/>
-          <w:lang w:val="en-US"/>
-        </w:rPr>
-      </w:pPr>
-    </w:p>
-    <w:p>
-      <w:pPr>
-        <w:jc w:val="left"/>
-        <w:rPr>
-          <w:rFonts w:hint="default" w:ascii="Tahoma" w:hAnsi="Tahoma" w:cs="Tahoma"/>
-          <w:sz w:val="22"/>
-          <w:szCs w:val="22"/>
-          <w:lang w:val="en-US"/>
-        </w:rPr>
-      </w:pPr>
-    </w:p>
-    <w:p>
-      <w:pPr>
-        <w:jc w:val="left"/>
-        <w:rPr>
-          <w:rFonts w:hint="default" w:ascii="Tahoma" w:hAnsi="Tahoma" w:cs="Tahoma"/>
-          <w:sz w:val="22"/>
-          <w:szCs w:val="22"/>
-          <w:lang w:val="en-US"/>
-        </w:rPr>
-      </w:pPr>
-    </w:p>
-    <w:p>
-      <w:pPr>
-        <w:jc w:val="left"/>
-        <w:rPr>
-          <w:rFonts w:hint="default" w:ascii="Tahoma" w:hAnsi="Tahoma" w:cs="Tahoma"/>
-          <w:sz w:val="22"/>
-          <w:szCs w:val="22"/>
-          <w:lang w:val="en-US"/>
-        </w:rPr>
-      </w:pPr>
-    </w:p>
-    <w:p>
-      <w:pPr>
-        <w:jc w:val="left"/>
-        <w:rPr>
-          <w:rFonts w:hint="default" w:ascii="Tahoma" w:hAnsi="Tahoma" w:cs="Tahoma"/>
-          <w:sz w:val="22"/>
-          <w:szCs w:val="22"/>
-          <w:lang w:val="en-US"/>
-        </w:rPr>
-      </w:pPr>
-    </w:p>
-    <w:p>
-      <w:pPr>
-        <w:jc w:val="left"/>
-        <w:rPr>
-          <w:rFonts w:hint="default" w:ascii="Tahoma" w:hAnsi="Tahoma" w:cs="Tahoma"/>
-          <w:sz w:val="22"/>
-          <w:szCs w:val="22"/>
-          <w:lang w:val="en-US"/>
-        </w:rPr>
-      </w:pPr>
-    </w:p>
-    <w:p>
-      <w:pPr>
-        <w:jc w:val="left"/>
-        <w:rPr>
-          <w:rFonts w:hint="default" w:ascii="Tahoma" w:hAnsi="Tahoma" w:cs="Tahoma"/>
-          <w:sz w:val="22"/>
-          <w:szCs w:val="22"/>
-          <w:lang w:val="en-US"/>
-        </w:rPr>
-      </w:pPr>
-    </w:p>
-    <w:p>
-      <w:pPr>
-        <w:jc w:val="left"/>
-        <w:rPr>
-          <w:rFonts w:hint="default" w:ascii="Tahoma" w:hAnsi="Tahoma" w:cs="Tahoma"/>
-          <w:sz w:val="22"/>
-          <w:szCs w:val="22"/>
-          <w:lang w:val="en-US"/>
-        </w:rPr>
-      </w:pPr>
-    </w:p>
-    <w:p>
-      <w:pPr>
-        <w:jc w:val="left"/>
-        <w:rPr>
-          <w:rFonts w:hint="default" w:ascii="Tahoma" w:hAnsi="Tahoma" w:cs="Tahoma"/>
-          <w:sz w:val="22"/>
-          <w:szCs w:val="22"/>
-          <w:lang w:val="en-US"/>
-        </w:rPr>
-      </w:pPr>
-    </w:p>
-    <w:p>
-      <w:pPr>
-        <w:jc w:val="left"/>
+        <w:jc w:val="both"/>
         <w:rPr>
           <w:rFonts w:hint="default" w:ascii="Tahoma" w:hAnsi="Tahoma" w:cs="Tahoma"/>
           <w:sz w:val="22"/>
@@ -2179,6 +2092,7 @@
     </w:p>
     <w:p>
       <w:pPr>
+        <w:jc w:val="both"/>
         <w:rPr>
           <w:rFonts w:hint="default" w:ascii="Tahoma" w:hAnsi="Tahoma" w:cs="Tahoma"/>
           <w:sz w:val="22"/>
@@ -2298,6 +2212,7 @@
     </w:p>
     <w:p>
       <w:pPr>
+        <w:jc w:val="both"/>
         <w:rPr>
           <w:rFonts w:hint="default" w:ascii="Tahoma" w:hAnsi="Tahoma" w:cs="Tahoma"/>
           <w:sz w:val="22"/>
@@ -2375,6 +2290,7 @@
     </w:p>
     <w:p>
       <w:pPr>
+        <w:jc w:val="both"/>
         <w:rPr>
           <w:rFonts w:hint="default" w:ascii="Tahoma" w:hAnsi="Tahoma" w:cs="Tahoma"/>
           <w:sz w:val="22"/>
@@ -2492,6 +2408,7 @@
     </w:p>
     <w:p>
       <w:pPr>
+        <w:jc w:val="both"/>
         <w:rPr>
           <w:rFonts w:hint="default" w:ascii="Tahoma" w:hAnsi="Tahoma" w:cs="Tahoma"/>
           <w:sz w:val="22"/>
@@ -2661,8 +2578,8 @@
           <w:rFonts w:hint="default" w:ascii="Tahoma" w:hAnsi="Tahoma" w:cs="Tahoma"/>
           <w:b/>
           <w:bCs/>
-          <w:sz w:val="36"/>
-          <w:szCs w:val="36"/>
+          <w:sz w:val="40"/>
+          <w:szCs w:val="40"/>
           <w:lang w:val="en-US"/>
         </w:rPr>
       </w:pPr>
@@ -2671,8 +2588,8 @@
           <w:rFonts w:hint="default" w:ascii="Tahoma" w:hAnsi="Tahoma" w:cs="Tahoma"/>
           <w:b/>
           <w:bCs/>
-          <w:sz w:val="36"/>
-          <w:szCs w:val="36"/>
+          <w:sz w:val="40"/>
+          <w:szCs w:val="40"/>
           <w:lang w:val="en-US"/>
         </w:rPr>
         <w:t>Insights and Findings</w:t>
@@ -2690,6 +2607,7 @@
     </w:p>
     <w:p>
       <w:pPr>
+        <w:jc w:val="both"/>
         <w:rPr>
           <w:rFonts w:hint="default" w:ascii="Tahoma" w:hAnsi="Tahoma" w:cs="Tahoma"/>
           <w:sz w:val="22"/>
@@ -2709,16 +2627,18 @@
     </w:p>
     <w:p>
       <w:pPr>
-        <w:rPr>
-          <w:rFonts w:hint="default" w:ascii="Tahoma" w:hAnsi="Tahoma" w:cs="Tahoma"/>
-          <w:sz w:val="22"/>
-          <w:szCs w:val="22"/>
-          <w:lang w:val="en-US"/>
-        </w:rPr>
-      </w:pPr>
-    </w:p>
-    <w:p>
-      <w:pPr>
+        <w:jc w:val="both"/>
+        <w:rPr>
+          <w:rFonts w:hint="default" w:ascii="Tahoma" w:hAnsi="Tahoma" w:cs="Tahoma"/>
+          <w:sz w:val="22"/>
+          <w:szCs w:val="22"/>
+          <w:lang w:val="en-US"/>
+        </w:rPr>
+      </w:pPr>
+    </w:p>
+    <w:p>
+      <w:pPr>
+        <w:jc w:val="both"/>
         <w:rPr>
           <w:rFonts w:hint="default" w:ascii="Tahoma" w:hAnsi="Tahoma" w:cs="Tahoma"/>
           <w:sz w:val="22"/>
@@ -2735,21 +2655,21 @@
         </w:rPr>
         <w:t xml:space="preserve">To see the summarized findings ready for a presentation please download the file here: </w:t>
       </w:r>
-      <w:bookmarkStart w:id="0" w:name="_GoBack"/>
-      <w:bookmarkEnd w:id="0"/>
-    </w:p>
-    <w:p>
-      <w:pPr>
-        <w:rPr>
-          <w:rFonts w:hint="default" w:ascii="Tahoma" w:hAnsi="Tahoma" w:cs="Tahoma"/>
-          <w:sz w:val="22"/>
-          <w:szCs w:val="22"/>
-          <w:lang w:val="en-US"/>
-        </w:rPr>
-      </w:pPr>
-    </w:p>
-    <w:p>
-      <w:pPr>
+    </w:p>
+    <w:p>
+      <w:pPr>
+        <w:jc w:val="both"/>
+        <w:rPr>
+          <w:rFonts w:hint="default" w:ascii="Tahoma" w:hAnsi="Tahoma" w:cs="Tahoma"/>
+          <w:sz w:val="22"/>
+          <w:szCs w:val="22"/>
+          <w:lang w:val="en-US"/>
+        </w:rPr>
+      </w:pPr>
+    </w:p>
+    <w:p>
+      <w:pPr>
+        <w:jc w:val="both"/>
         <w:rPr>
           <w:rFonts w:hint="default" w:ascii="Tahoma" w:hAnsi="Tahoma" w:cs="Tahoma"/>
           <w:sz w:val="22"/>
@@ -2786,7 +2706,7 @@
       </w:r>
       <w:r>
         <w:rPr>
-          <w:rStyle w:val="5"/>
+          <w:rStyle w:val="7"/>
           <w:rFonts w:hint="default" w:ascii="Tahoma" w:hAnsi="Tahoma" w:cs="Tahoma"/>
           <w:sz w:val="22"/>
           <w:szCs w:val="22"/>
@@ -2806,16 +2726,18 @@
     </w:p>
     <w:p>
       <w:pPr>
-        <w:rPr>
-          <w:rFonts w:hint="default" w:ascii="Tahoma" w:hAnsi="Tahoma" w:cs="Tahoma"/>
-          <w:sz w:val="22"/>
-          <w:szCs w:val="22"/>
-          <w:lang w:val="en-US"/>
-        </w:rPr>
-      </w:pPr>
-    </w:p>
-    <w:p>
-      <w:pPr>
+        <w:jc w:val="both"/>
+        <w:rPr>
+          <w:rFonts w:hint="default" w:ascii="Tahoma" w:hAnsi="Tahoma" w:cs="Tahoma"/>
+          <w:sz w:val="22"/>
+          <w:szCs w:val="22"/>
+          <w:lang w:val="en-US"/>
+        </w:rPr>
+      </w:pPr>
+    </w:p>
+    <w:p>
+      <w:pPr>
+        <w:jc w:val="both"/>
         <w:rPr>
           <w:rFonts w:hint="default" w:ascii="Tahoma" w:hAnsi="Tahoma" w:cs="Tahoma"/>
           <w:sz w:val="22"/>
@@ -2835,23 +2757,28 @@
     </w:p>
     <w:p>
       <w:pPr>
-        <w:rPr>
-          <w:rFonts w:hint="default" w:ascii="Tahoma" w:hAnsi="Tahoma" w:cs="Tahoma"/>
-          <w:sz w:val="22"/>
-          <w:szCs w:val="22"/>
-          <w:lang w:val="en-US"/>
-        </w:rPr>
-      </w:pPr>
-    </w:p>
-    <w:p>
-      <w:pPr>
-        <w:rPr>
-          <w:rFonts w:hint="default" w:ascii="Tahoma" w:hAnsi="Tahoma" w:cs="Tahoma"/>
-        </w:rPr>
-      </w:pPr>
-      <w:r>
-        <w:rPr>
-          <w:rFonts w:hint="default" w:ascii="Tahoma" w:hAnsi="Tahoma" w:cs="Tahoma"/>
+        <w:jc w:val="both"/>
+        <w:rPr>
+          <w:rFonts w:hint="default" w:ascii="Tahoma" w:hAnsi="Tahoma" w:cs="Tahoma"/>
+          <w:sz w:val="22"/>
+          <w:szCs w:val="22"/>
+          <w:lang w:val="en-US"/>
+        </w:rPr>
+      </w:pPr>
+    </w:p>
+    <w:p>
+      <w:pPr>
+        <w:rPr>
+          <w:rFonts w:hint="default" w:ascii="Tahoma" w:hAnsi="Tahoma" w:cs="Tahoma"/>
+          <w:sz w:val="22"/>
+          <w:szCs w:val="22"/>
+        </w:rPr>
+      </w:pPr>
+      <w:r>
+        <w:rPr>
+          <w:rFonts w:hint="default" w:ascii="Tahoma" w:hAnsi="Tahoma" w:cs="Tahoma"/>
+          <w:sz w:val="22"/>
+          <w:szCs w:val="22"/>
         </w:rPr>
         <w:drawing>
           <wp:inline distT="0" distB="0" distL="114300" distR="114300">
@@ -2900,11 +2827,14 @@
       <w:pPr>
         <w:rPr>
           <w:rFonts w:hint="default" w:ascii="Tahoma" w:hAnsi="Tahoma" w:cs="Tahoma"/>
-        </w:rPr>
-      </w:pPr>
-    </w:p>
-    <w:p>
-      <w:pPr>
+          <w:sz w:val="22"/>
+          <w:szCs w:val="22"/>
+        </w:rPr>
+      </w:pPr>
+    </w:p>
+    <w:p>
+      <w:pPr>
+        <w:jc w:val="both"/>
         <w:rPr>
           <w:rFonts w:hint="default" w:ascii="Tahoma" w:hAnsi="Tahoma" w:cs="Tahoma"/>
           <w:sz w:val="22"/>
@@ -2962,15 +2892,18 @@
     </w:p>
     <w:p>
       <w:pPr>
-        <w:rPr>
-          <w:rFonts w:hint="default" w:ascii="Tahoma" w:hAnsi="Tahoma" w:cs="Tahoma"/>
-          <w:sz w:val="22"/>
-          <w:szCs w:val="22"/>
-        </w:rPr>
-      </w:pPr>
-      <w:r>
-        <w:rPr>
-          <w:rFonts w:hint="default" w:ascii="Tahoma" w:hAnsi="Tahoma" w:cs="Tahoma"/>
+        <w:jc w:val="both"/>
+        <w:rPr>
+          <w:rFonts w:hint="default" w:ascii="Tahoma" w:hAnsi="Tahoma" w:cs="Tahoma"/>
+          <w:sz w:val="22"/>
+          <w:szCs w:val="22"/>
+        </w:rPr>
+      </w:pPr>
+      <w:r>
+        <w:rPr>
+          <w:rFonts w:hint="default" w:ascii="Tahoma" w:hAnsi="Tahoma" w:cs="Tahoma"/>
+          <w:sz w:val="22"/>
+          <w:szCs w:val="22"/>
         </w:rPr>
         <w:drawing>
           <wp:inline distT="0" distB="0" distL="114300" distR="114300">
@@ -3017,6 +2950,7 @@
     </w:p>
     <w:p>
       <w:pPr>
+        <w:jc w:val="both"/>
         <w:rPr>
           <w:rFonts w:hint="default" w:ascii="Tahoma" w:hAnsi="Tahoma" w:cs="Tahoma"/>
           <w:sz w:val="22"/>
@@ -3055,6 +2989,7 @@
     </w:p>
     <w:p>
       <w:pPr>
+        <w:jc w:val="both"/>
         <w:rPr>
           <w:rFonts w:hint="default" w:ascii="Tahoma" w:hAnsi="Tahoma" w:cs="Tahoma"/>
           <w:sz w:val="22"/>
@@ -3065,13 +3000,18 @@
     </w:p>
     <w:p>
       <w:pPr>
-        <w:rPr>
-          <w:rFonts w:hint="default" w:ascii="Tahoma" w:hAnsi="Tahoma" w:cs="Tahoma"/>
-        </w:rPr>
-      </w:pPr>
-      <w:r>
-        <w:rPr>
-          <w:rFonts w:hint="default" w:ascii="Tahoma" w:hAnsi="Tahoma" w:cs="Tahoma"/>
+        <w:jc w:val="both"/>
+        <w:rPr>
+          <w:rFonts w:hint="default" w:ascii="Tahoma" w:hAnsi="Tahoma" w:cs="Tahoma"/>
+          <w:sz w:val="22"/>
+          <w:szCs w:val="22"/>
+        </w:rPr>
+      </w:pPr>
+      <w:r>
+        <w:rPr>
+          <w:rFonts w:hint="default" w:ascii="Tahoma" w:hAnsi="Tahoma" w:cs="Tahoma"/>
+          <w:sz w:val="22"/>
+          <w:szCs w:val="22"/>
         </w:rPr>
         <w:drawing>
           <wp:inline distT="0" distB="0" distL="114300" distR="114300">
@@ -3118,6 +3058,7 @@
     </w:p>
     <w:p>
       <w:pPr>
+        <w:jc w:val="both"/>
         <w:rPr>
           <w:rFonts w:hint="default" w:ascii="Tahoma" w:hAnsi="Tahoma" w:cs="Tahoma"/>
           <w:sz w:val="22"/>
@@ -3142,7 +3083,19 @@
           <w:u w:val="single"/>
           <w:lang w:val="en-PH"/>
         </w:rPr>
-        <w:t>One-time users have more number of rides as well as have longer rides than subscribed bikers in the top 3 stations most rides start at</w:t>
+        <w:t>One-time users have more number of rides as well as have longer rides tha</w:t>
+      </w:r>
+      <w:bookmarkStart w:id="0" w:name="_GoBack"/>
+      <w:bookmarkEnd w:id="0"/>
+      <w:r>
+        <w:rPr>
+          <w:rFonts w:hint="default" w:ascii="Tahoma" w:hAnsi="Tahoma" w:cs="Tahoma"/>
+          <w:sz w:val="22"/>
+          <w:szCs w:val="22"/>
+          <w:u w:val="single"/>
+          <w:lang w:val="en-PH"/>
+        </w:rPr>
+        <w:t>n subscribed bikers in the top 3 stations most rides start at</w:t>
       </w:r>
       <w:r>
         <w:rPr>
@@ -3185,6 +3138,7 @@
     </w:p>
     <w:p>
       <w:pPr>
+        <w:jc w:val="both"/>
         <w:rPr>
           <w:rFonts w:hint="default" w:ascii="Tahoma" w:hAnsi="Tahoma" w:cs="Tahoma"/>
           <w:sz w:val="22"/>
@@ -3290,6 +3244,7 @@
     </w:p>
     <w:p>
       <w:pPr>
+        <w:jc w:val="both"/>
         <w:rPr>
           <w:rFonts w:hint="default" w:ascii="Tahoma" w:hAnsi="Tahoma" w:cs="Tahoma"/>
           <w:sz w:val="22"/>
@@ -3300,6 +3255,7 @@
     </w:p>
     <w:p>
       <w:pPr>
+        <w:jc w:val="both"/>
         <w:rPr>
           <w:rFonts w:hint="default" w:ascii="Tahoma" w:hAnsi="Tahoma" w:cs="Tahoma"/>
           <w:sz w:val="22"/>
@@ -3357,6 +3313,7 @@
     </w:p>
     <w:p>
       <w:pPr>
+        <w:jc w:val="both"/>
         <w:rPr>
           <w:rFonts w:hint="default" w:ascii="Tahoma" w:hAnsi="Tahoma" w:cs="Tahoma"/>
           <w:sz w:val="22"/>
@@ -3414,6 +3371,7 @@
     </w:p>
     <w:p>
       <w:pPr>
+        <w:jc w:val="both"/>
         <w:rPr>
           <w:rFonts w:hint="default" w:ascii="Tahoma" w:hAnsi="Tahoma" w:cs="Tahoma"/>
           <w:sz w:val="22"/>
@@ -3424,6 +3382,7 @@
     </w:p>
     <w:p>
       <w:pPr>
+        <w:jc w:val="both"/>
         <w:rPr>
           <w:rFonts w:hint="default" w:ascii="Tahoma" w:hAnsi="Tahoma" w:cs="Tahoma"/>
           <w:sz w:val="22"/>
@@ -3481,6 +3440,7 @@
     </w:p>
     <w:p>
       <w:pPr>
+        <w:jc w:val="both"/>
         <w:rPr>
           <w:rFonts w:hint="default" w:ascii="Tahoma" w:hAnsi="Tahoma" w:cs="Tahoma"/>
           <w:sz w:val="22"/>
@@ -3500,16 +3460,18 @@
     </w:p>
     <w:p>
       <w:pPr>
-        <w:rPr>
-          <w:rFonts w:hint="default" w:ascii="Tahoma" w:hAnsi="Tahoma" w:cs="Tahoma"/>
-          <w:sz w:val="22"/>
-          <w:szCs w:val="22"/>
-          <w:lang w:val="en-US"/>
-        </w:rPr>
-      </w:pPr>
-    </w:p>
-    <w:p>
-      <w:pPr>
+        <w:jc w:val="both"/>
+        <w:rPr>
+          <w:rFonts w:hint="default" w:ascii="Tahoma" w:hAnsi="Tahoma" w:cs="Tahoma"/>
+          <w:sz w:val="22"/>
+          <w:szCs w:val="22"/>
+          <w:lang w:val="en-US"/>
+        </w:rPr>
+      </w:pPr>
+    </w:p>
+    <w:p>
+      <w:pPr>
+        <w:jc w:val="both"/>
         <w:rPr>
           <w:rFonts w:hint="default" w:ascii="Tahoma" w:hAnsi="Tahoma" w:cs="Tahoma"/>
           <w:sz w:val="22"/>
@@ -3567,6 +3529,7 @@
     </w:p>
     <w:p>
       <w:pPr>
+        <w:jc w:val="both"/>
         <w:rPr>
           <w:rFonts w:hint="default" w:ascii="Tahoma" w:hAnsi="Tahoma" w:cs="Tahoma"/>
           <w:sz w:val="22"/>
@@ -3613,6 +3576,7 @@
     </w:p>
     <w:p>
       <w:pPr>
+        <w:jc w:val="both"/>
         <w:rPr>
           <w:rFonts w:hint="default" w:ascii="Tahoma" w:hAnsi="Tahoma" w:cs="Tahoma"/>
           <w:sz w:val="22"/>
@@ -3623,6 +3587,7 @@
     </w:p>
     <w:p>
       <w:pPr>
+        <w:jc w:val="both"/>
         <w:rPr>
           <w:rFonts w:hint="default" w:ascii="Tahoma" w:hAnsi="Tahoma" w:cs="Tahoma"/>
           <w:sz w:val="22"/>
@@ -3680,6 +3645,7 @@
     </w:p>
     <w:p>
       <w:pPr>
+        <w:jc w:val="both"/>
         <w:rPr>
           <w:rFonts w:hint="default" w:ascii="Tahoma" w:hAnsi="Tahoma" w:cs="Tahoma"/>
           <w:sz w:val="22"/>
@@ -3744,16 +3710,18 @@
     </w:p>
     <w:p>
       <w:pPr>
-        <w:rPr>
-          <w:rFonts w:hint="default" w:ascii="Tahoma" w:hAnsi="Tahoma" w:cs="Tahoma"/>
-          <w:sz w:val="22"/>
-          <w:szCs w:val="22"/>
-          <w:lang w:val="en-US"/>
-        </w:rPr>
-      </w:pPr>
-    </w:p>
-    <w:p>
-      <w:pPr>
+        <w:jc w:val="both"/>
+        <w:rPr>
+          <w:rFonts w:hint="default" w:ascii="Tahoma" w:hAnsi="Tahoma" w:cs="Tahoma"/>
+          <w:sz w:val="22"/>
+          <w:szCs w:val="22"/>
+          <w:lang w:val="en-US"/>
+        </w:rPr>
+      </w:pPr>
+    </w:p>
+    <w:p>
+      <w:pPr>
+        <w:jc w:val="both"/>
         <w:rPr>
           <w:rFonts w:hint="default" w:ascii="Tahoma" w:hAnsi="Tahoma" w:cs="Tahoma"/>
           <w:sz w:val="22"/>
@@ -3811,15 +3779,17 @@
     </w:p>
     <w:p>
       <w:pPr>
-        <w:rPr>
-          <w:rFonts w:hint="default" w:ascii="Tahoma" w:hAnsi="Tahoma" w:cs="Tahoma"/>
-          <w:sz w:val="22"/>
-          <w:szCs w:val="22"/>
-        </w:rPr>
-      </w:pPr>
-    </w:p>
-    <w:p>
-      <w:pPr>
+        <w:jc w:val="both"/>
+        <w:rPr>
+          <w:rFonts w:hint="default" w:ascii="Tahoma" w:hAnsi="Tahoma" w:cs="Tahoma"/>
+          <w:sz w:val="22"/>
+          <w:szCs w:val="22"/>
+        </w:rPr>
+      </w:pPr>
+    </w:p>
+    <w:p>
+      <w:pPr>
+        <w:jc w:val="both"/>
         <w:rPr>
           <w:rFonts w:hint="default" w:ascii="Tahoma" w:hAnsi="Tahoma" w:cs="Tahoma"/>
           <w:sz w:val="22"/>
@@ -3858,16 +3828,18 @@
     </w:p>
     <w:p>
       <w:pPr>
-        <w:rPr>
-          <w:rFonts w:hint="default" w:ascii="Tahoma" w:hAnsi="Tahoma" w:cs="Tahoma"/>
-          <w:sz w:val="22"/>
-          <w:szCs w:val="22"/>
-          <w:lang w:val="en-US"/>
-        </w:rPr>
-      </w:pPr>
-    </w:p>
-    <w:p>
-      <w:pPr>
+        <w:jc w:val="both"/>
+        <w:rPr>
+          <w:rFonts w:hint="default" w:ascii="Tahoma" w:hAnsi="Tahoma" w:cs="Tahoma"/>
+          <w:sz w:val="22"/>
+          <w:szCs w:val="22"/>
+          <w:lang w:val="en-US"/>
+        </w:rPr>
+      </w:pPr>
+    </w:p>
+    <w:p>
+      <w:pPr>
+        <w:jc w:val="both"/>
         <w:rPr>
           <w:rFonts w:hint="default" w:ascii="Tahoma" w:hAnsi="Tahoma" w:cs="Tahoma"/>
           <w:sz w:val="22"/>
@@ -3887,16 +3859,18 @@
     </w:p>
     <w:p>
       <w:pPr>
-        <w:rPr>
-          <w:rFonts w:hint="default" w:ascii="Tahoma" w:hAnsi="Tahoma" w:cs="Tahoma"/>
-          <w:sz w:val="22"/>
-          <w:szCs w:val="22"/>
-          <w:lang w:val="en-US"/>
-        </w:rPr>
-      </w:pPr>
-    </w:p>
-    <w:p>
-      <w:pPr>
+        <w:jc w:val="both"/>
+        <w:rPr>
+          <w:rFonts w:hint="default" w:ascii="Tahoma" w:hAnsi="Tahoma" w:cs="Tahoma"/>
+          <w:sz w:val="22"/>
+          <w:szCs w:val="22"/>
+          <w:lang w:val="en-US"/>
+        </w:rPr>
+      </w:pPr>
+    </w:p>
+    <w:p>
+      <w:pPr>
+        <w:jc w:val="both"/>
         <w:rPr>
           <w:rFonts w:hint="default" w:ascii="Tahoma" w:hAnsi="Tahoma" w:cs="Tahoma"/>
           <w:sz w:val="22"/>
@@ -3916,16 +3890,18 @@
     </w:p>
     <w:p>
       <w:pPr>
-        <w:rPr>
-          <w:rFonts w:hint="default" w:ascii="Tahoma" w:hAnsi="Tahoma" w:cs="Tahoma"/>
-          <w:sz w:val="22"/>
-          <w:szCs w:val="22"/>
-          <w:lang w:val="en-US"/>
-        </w:rPr>
-      </w:pPr>
-    </w:p>
-    <w:p>
-      <w:pPr>
+        <w:jc w:val="both"/>
+        <w:rPr>
+          <w:rFonts w:hint="default" w:ascii="Tahoma" w:hAnsi="Tahoma" w:cs="Tahoma"/>
+          <w:sz w:val="22"/>
+          <w:szCs w:val="22"/>
+          <w:lang w:val="en-US"/>
+        </w:rPr>
+      </w:pPr>
+    </w:p>
+    <w:p>
+      <w:pPr>
+        <w:jc w:val="both"/>
         <w:rPr>
           <w:rFonts w:hint="default" w:ascii="Tahoma" w:hAnsi="Tahoma" w:cs="Tahoma"/>
           <w:b/>
@@ -3938,6 +3914,7 @@
     </w:p>
     <w:p>
       <w:pPr>
+        <w:jc w:val="both"/>
         <w:rPr>
           <w:rFonts w:hint="default" w:ascii="Tahoma" w:hAnsi="Tahoma" w:cs="Tahoma"/>
           <w:b/>
@@ -3950,6 +3927,7 @@
     </w:p>
     <w:p>
       <w:pPr>
+        <w:jc w:val="both"/>
         <w:rPr>
           <w:rFonts w:hint="default" w:ascii="Tahoma" w:hAnsi="Tahoma" w:cs="Tahoma"/>
           <w:b/>
@@ -3962,6 +3940,7 @@
     </w:p>
     <w:p>
       <w:pPr>
+        <w:jc w:val="both"/>
         <w:rPr>
           <w:rFonts w:hint="default" w:ascii="Tahoma" w:hAnsi="Tahoma" w:cs="Tahoma"/>
           <w:b/>
@@ -3974,6 +3953,7 @@
     </w:p>
     <w:p>
       <w:pPr>
+        <w:jc w:val="both"/>
         <w:rPr>
           <w:rFonts w:hint="default" w:ascii="Tahoma" w:hAnsi="Tahoma" w:cs="Tahoma"/>
           <w:sz w:val="22"/>
@@ -3986,8 +3966,8 @@
           <w:rFonts w:hint="default" w:ascii="Tahoma" w:hAnsi="Tahoma" w:cs="Tahoma"/>
           <w:b/>
           <w:bCs/>
-          <w:sz w:val="36"/>
-          <w:szCs w:val="36"/>
+          <w:sz w:val="40"/>
+          <w:szCs w:val="40"/>
           <w:lang w:val="en-US"/>
         </w:rPr>
         <w:t>Conclusion</w:t>
@@ -3995,16 +3975,18 @@
     </w:p>
     <w:p>
       <w:pPr>
-        <w:rPr>
-          <w:rFonts w:hint="default" w:ascii="Tahoma" w:hAnsi="Tahoma" w:cs="Tahoma"/>
-          <w:sz w:val="22"/>
-          <w:szCs w:val="22"/>
-          <w:lang w:val="en-US"/>
-        </w:rPr>
-      </w:pPr>
-    </w:p>
-    <w:p>
-      <w:pPr>
+        <w:jc w:val="both"/>
+        <w:rPr>
+          <w:rFonts w:hint="default" w:ascii="Tahoma" w:hAnsi="Tahoma" w:cs="Tahoma"/>
+          <w:sz w:val="22"/>
+          <w:szCs w:val="22"/>
+          <w:lang w:val="en-US"/>
+        </w:rPr>
+      </w:pPr>
+    </w:p>
+    <w:p>
+      <w:pPr>
+        <w:jc w:val="both"/>
         <w:rPr>
           <w:rFonts w:hint="default" w:ascii="Tahoma" w:hAnsi="Tahoma" w:cs="Tahoma"/>
           <w:sz w:val="22"/>
@@ -4024,6 +4006,7 @@
     </w:p>
     <w:p>
       <w:pPr>
+        <w:jc w:val="both"/>
         <w:rPr>
           <w:rFonts w:hint="default" w:ascii="Tahoma" w:hAnsi="Tahoma" w:cs="Tahoma"/>
           <w:sz w:val="22"/>
@@ -4045,8 +4028,8 @@
           <w:rFonts w:hint="default" w:ascii="Tahoma" w:hAnsi="Tahoma" w:cs="Tahoma"/>
           <w:b/>
           <w:bCs/>
-          <w:sz w:val="36"/>
-          <w:szCs w:val="36"/>
+          <w:sz w:val="40"/>
+          <w:szCs w:val="40"/>
           <w:lang w:val="en-US"/>
         </w:rPr>
         <w:t>Recommendation</w:t>
@@ -4054,16 +4037,18 @@
     </w:p>
     <w:p>
       <w:pPr>
-        <w:rPr>
-          <w:rFonts w:hint="default" w:ascii="Tahoma" w:hAnsi="Tahoma" w:cs="Tahoma"/>
-          <w:sz w:val="22"/>
-          <w:szCs w:val="22"/>
-          <w:lang w:val="en-US"/>
-        </w:rPr>
-      </w:pPr>
-    </w:p>
-    <w:p>
-      <w:pPr>
+        <w:jc w:val="both"/>
+        <w:rPr>
+          <w:rFonts w:hint="default" w:ascii="Tahoma" w:hAnsi="Tahoma" w:cs="Tahoma"/>
+          <w:sz w:val="22"/>
+          <w:szCs w:val="22"/>
+          <w:lang w:val="en-US"/>
+        </w:rPr>
+      </w:pPr>
+    </w:p>
+    <w:p>
+      <w:pPr>
+        <w:jc w:val="both"/>
         <w:rPr>
           <w:rFonts w:hint="default" w:ascii="Tahoma" w:hAnsi="Tahoma" w:cs="Tahoma"/>
           <w:sz w:val="22"/>
@@ -4083,16 +4068,18 @@
     </w:p>
     <w:p>
       <w:pPr>
-        <w:rPr>
-          <w:rFonts w:hint="default" w:ascii="Tahoma" w:hAnsi="Tahoma" w:cs="Tahoma"/>
-          <w:sz w:val="22"/>
-          <w:szCs w:val="22"/>
-          <w:lang w:val="en-US"/>
-        </w:rPr>
-      </w:pPr>
-    </w:p>
-    <w:p>
-      <w:pPr>
+        <w:jc w:val="both"/>
+        <w:rPr>
+          <w:rFonts w:hint="default" w:ascii="Tahoma" w:hAnsi="Tahoma" w:cs="Tahoma"/>
+          <w:sz w:val="22"/>
+          <w:szCs w:val="22"/>
+          <w:lang w:val="en-US"/>
+        </w:rPr>
+      </w:pPr>
+    </w:p>
+    <w:p>
+      <w:pPr>
+        <w:jc w:val="both"/>
         <w:rPr>
           <w:rFonts w:hint="default" w:ascii="Tahoma" w:hAnsi="Tahoma" w:cs="Tahoma"/>
           <w:sz w:val="22"/>
@@ -4112,16 +4099,18 @@
     </w:p>
     <w:p>
       <w:pPr>
-        <w:rPr>
-          <w:rFonts w:hint="default" w:ascii="Tahoma" w:hAnsi="Tahoma" w:cs="Tahoma"/>
-          <w:sz w:val="22"/>
-          <w:szCs w:val="22"/>
-          <w:lang w:val="en-US"/>
-        </w:rPr>
-      </w:pPr>
-    </w:p>
-    <w:p>
-      <w:pPr>
+        <w:jc w:val="both"/>
+        <w:rPr>
+          <w:rFonts w:hint="default" w:ascii="Tahoma" w:hAnsi="Tahoma" w:cs="Tahoma"/>
+          <w:sz w:val="22"/>
+          <w:szCs w:val="22"/>
+          <w:lang w:val="en-US"/>
+        </w:rPr>
+      </w:pPr>
+    </w:p>
+    <w:p>
+      <w:pPr>
+        <w:jc w:val="both"/>
         <w:rPr>
           <w:rFonts w:hint="default" w:ascii="Tahoma" w:hAnsi="Tahoma" w:cs="Tahoma"/>
           <w:sz w:val="22"/>
@@ -4491,7 +4480,40 @@
       <w:u w:val="single"/>
     </w:rPr>
   </w:style>
-  <w:style w:type="character" w:styleId="5">
+  <w:style w:type="paragraph" w:styleId="5">
+    <w:name w:val="footer"/>
+    <w:basedOn w:val="1"/>
+    <w:uiPriority w:val="0"/>
+    <w:pPr>
+      <w:tabs>
+        <w:tab w:val="center" w:pos="4153"/>
+        <w:tab w:val="right" w:pos="8306"/>
+      </w:tabs>
+      <w:snapToGrid w:val="0"/>
+      <w:jc w:val="left"/>
+    </w:pPr>
+    <w:rPr>
+      <w:sz w:val="18"/>
+      <w:szCs w:val="18"/>
+    </w:rPr>
+  </w:style>
+  <w:style w:type="paragraph" w:styleId="6">
+    <w:name w:val="header"/>
+    <w:basedOn w:val="1"/>
+    <w:uiPriority w:val="0"/>
+    <w:pPr>
+      <w:tabs>
+        <w:tab w:val="center" w:pos="4153"/>
+        <w:tab w:val="right" w:pos="8306"/>
+      </w:tabs>
+      <w:snapToGrid w:val="0"/>
+    </w:pPr>
+    <w:rPr>
+      <w:sz w:val="18"/>
+      <w:szCs w:val="18"/>
+    </w:rPr>
+  </w:style>
+  <w:style w:type="character" w:styleId="7">
     <w:name w:val="Hyperlink"/>
     <w:basedOn w:val="2"/>
     <w:qFormat/>

</xml_diff>